<commit_message>
Add early-wins block to Coding CDI work plan executive summary
Executive summary now credits the wins already delivered before the
formal plan launch: streamlined BMI billing process, reduced provider-
facing action items, SOAP educational documentation for the billing
team, and a pediatric BMI reference table with step-by-step guide.

Co-Authored-By: Claude Opus 4.7 <noreply@anthropic.com>
Claude-Session: https://claude.ai/code/session_01FQCsD1ZdbqSqbtLgYtoLBe
</commit_message>
<xml_diff>
--- a/docs/Coding_CDI_Year1_Work_Plan.docx
+++ b/docs/Coding_CDI_Year1_Work_Plan.docx
@@ -196,6 +196,51 @@
     <w:p>
       <w:r>
         <w:t>The Coding &amp; Clinical Documentation Improvement (CDI) function is being built by a single lead. Provider documentation audits have already begun using an internal audit workbook aligned to ICD-10 Official Guidelines, CMS-HCC, MEAT criteria, HEDIS/Stars, HRSA/UDS, and OIG compliance guidance.</w:t>
+      </w:r>
+    </w:p>
+    <w:p>
+      <w:r>
+        <w:t>Early wins already delivered by the department:</w:t>
+      </w:r>
+    </w:p>
+    <w:p>
+      <w:pPr>
+        <w:pStyle w:val="ListBullet"/>
+        <w:spacing w:after="60"/>
+        <w:ind w:left="360"/>
+      </w:pPr>
+      <w:r>
+        <w:t>Improved the billing process for BMI capture — streamlined how BMI values move from the note into the claim, reducing the volume of provider-facing action items that were previously routine.</w:t>
+      </w:r>
+    </w:p>
+    <w:p>
+      <w:pPr>
+        <w:pStyle w:val="ListBullet"/>
+        <w:spacing w:after="60"/>
+        <w:ind w:left="360"/>
+      </w:pPr>
+      <w:r>
+        <w:t>Reduced the number of actions returned to providers by resolving documentation ambiguities upstream at the coding review stage rather than sending them back for clarification.</w:t>
+      </w:r>
+    </w:p>
+    <w:p>
+      <w:pPr>
+        <w:pStyle w:val="ListBullet"/>
+        <w:spacing w:after="60"/>
+        <w:ind w:left="360"/>
+      </w:pPr>
+      <w:r>
+        <w:t>Produced educational documentation for the billing team covering the SOAP note structure — what each section carries, why it matters for accurate coding, and how to read the note when supporting a claim.</w:t>
+      </w:r>
+    </w:p>
+    <w:p>
+      <w:pPr>
+        <w:pStyle w:val="ListBullet"/>
+        <w:spacing w:after="60"/>
+        <w:ind w:left="360"/>
+      </w:pPr>
+      <w:r>
+        <w:t>Produced a pediatric BMI reference table for the billing team with a step-by-step guide for locating the BMI value in the note, converting age-based percentiles when needed, and confirming the correct CPT II / diagnostic code.</w:t>
       </w:r>
     </w:p>
     <w:p>

</xml_diff>

<commit_message>
Expand executive-summary early wins on Coding CDI work plan
Add three additional wins already delivered:
- Built the internal audit workbook (5 categories, 16 elements,
  scoring, rollup, quarterly report).
- Drafted the formal 12-month work plan itself.
- Prepared a CDI provider education PowerPoint.

Co-Authored-By: Claude Opus 4.7 <noreply@anthropic.com>
Claude-Session: https://claude.ai/code/session_01FQCsD1ZdbqSqbtLgYtoLBe
</commit_message>
<xml_diff>
--- a/docs/Coding_CDI_Year1_Work_Plan.docx
+++ b/docs/Coding_CDI_Year1_Work_Plan.docx
@@ -241,6 +241,36 @@
       </w:pPr>
       <w:r>
         <w:t>Produced a pediatric BMI reference table for the billing team with a step-by-step guide for locating the BMI value in the note, converting age-based percentiles when needed, and confirming the correct CPT II / diagnostic code.</w:t>
+      </w:r>
+    </w:p>
+    <w:p>
+      <w:pPr>
+        <w:pStyle w:val="ListBullet"/>
+        <w:spacing w:after="60"/>
+        <w:ind w:left="360"/>
+      </w:pPr>
+      <w:r>
+        <w:t>Built an internal audit workbook for Clinical Documentation Improvement — 5 weighted categories, 16 audit elements, per-claim scoring, provider-level metrics rollup, and quarterly reporting all in one tool.</w:t>
+      </w:r>
+    </w:p>
+    <w:p>
+      <w:pPr>
+        <w:pStyle w:val="ListBullet"/>
+        <w:spacing w:after="60"/>
+        <w:ind w:left="360"/>
+      </w:pPr>
+      <w:r>
+        <w:t>Drafted this formal 12-month work plan defining scope, cadence, KPIs, and the hire trigger — giving leadership a predictable roadmap rather than an ad-hoc effort.</w:t>
+      </w:r>
+    </w:p>
+    <w:p>
+      <w:pPr>
+        <w:pStyle w:val="ListBullet"/>
+        <w:spacing w:after="60"/>
+        <w:ind w:left="360"/>
+      </w:pPr>
+      <w:r>
+        <w:t>Prepared an educational PowerPoint for providers on CDI — covering documentation expectations, common findings, and how audit feedback will be delivered.</w:t>
       </w:r>
     </w:p>
     <w:p>

</xml_diff>